<commit_message>
Contratos Globaltec: edad, sueldo desde REM_BASICA y texto tras cargo.
Calcula edad por BirthDate; prioriza remuneracion permanente vigente; restaura coletilla del parrafo Segundo tras {{ cargo }}.

Co-authored-by: Cursor <cursoragent@cursor.com>
</commit_message>
<xml_diff>
--- a/uploads/contratos_plantillas/hm_globaltec/BGT/CONTRATO_GLOBALTEC_HORARIO_0830_1815.docx
+++ b/uploads/contratos_plantillas/hm_globaltec/BGT/CONTRATO_GLOBALTEC_HORARIO_0830_1815.docx
@@ -114,7 +114,7 @@
           <w:sz w:val="19"/>
           <w:szCs w:val="19"/>
         </w:rPr>
-        <w:t>Conste por el presente documento en triplicado, el Contrato de Trabajo, Sujeto a Modalidad por Necesidad del Mercado, que celebran conforme al Art. 58° del D.S. 003-97-TR, Ley de Productividad Laboral, de una parte {{ empresa }}, con RUC N° {{ ruc }}, y domicilio legal en {{ domicilio_empresa }} a la que se le denominará LA EMPRESA, debidamente representada por {{ representante }}, identificado con {{ doc_representante }}; y de otra parte {{ trabajador }}, al que en lo sucesivo se le designará como EL TRABAJADOR, identificado con D.N.I. N° {{ dni }}, de 38 años de edad, de sexo {{ sexo }}, con domicilio en {{ direccion }}, {{ distrito }}, en los términos y condiciones siguientes:</w:t>
+        <w:t>Conste por el presente documento en triplicado, el Contrato de Trabajo, Sujeto a Modalidad por Necesidad del Mercado, que celebran conforme al Art. 58° del D.S. 003-97-TR, Ley de Productividad Laboral, de una parte {{ empresa }}, con RUC N° {{ ruc }}, y domicilio legal en {{ domicilio_empresa }} a la que se le denominará LA EMPRESA, debidamente representada por {{ representante }}, identificado con {{ doc_representante }}; y de otra parte {{ trabajador }}, al que en lo sucesivo se le designará como EL TRABAJADOR, identificado con D.N.I. N° {{ dni }}, de {{ edad }} años de edad, de sexo {{ sexo }}, con domicilio en {{ direccion }}, {{ distrito }}, en los términos y condiciones siguientes:</w:t>
       </w:r>
       <w:r>
         <w:rPr>
@@ -673,7 +673,7 @@
           <w:sz w:val="19"/>
           <w:szCs w:val="19"/>
         </w:rPr>
-        <w:t xml:space="preserve">Segundo.- En virtud del presente documento, “La Empresa” contrata a plazo fijo, y bajo la modalidad indicada los servicios del “trabajador” para que realice las labores propias y complementarias de {{ cargo }} </w:t>
+        <w:t>Segundo.- En virtud del presente documento, “La Empresa” contrata a plazo fijo, y bajo la modalidad indicada los servicios del “trabajador” para que realice las labores propias y complementarias de {{ cargo }} en razón de las causas objetivas mencionadas en la Cláusula anterior.</w:t>
       </w:r>
       <w:r>
         <w:rPr>

</xml_diff>